<commit_message>
fix(em): support Sophia Santamaria (SAS) as 5d plate reader across Section A, Section D, and Table 1
</commit_message>
<xml_diff>
--- a/OOS-261187_ScanCO_CGS_E001309_S1_UPDATED.docx
+++ b/OOS-261187_ScanCO_CGS_E001309_S1_UPDATED.docx
@@ -483,7 +483,7 @@
               <w:br/>
               <w:t xml:space="preserve"/>
               <w:br/>
-              <w:t xml:space="preserve">Maraya Chukwumerije and Simin Mohammad</w:t>
+              <w:t xml:space="preserve">Maraya Chukwumerije and Sophia Santamaria</w:t>
               <w:br/>
               <w:t xml:space="preserve">(Surface Sampling (Changeover) Plate Reader)</w:t>
             </w:r>
@@ -1826,7 +1826,7 @@
                 <w:sz w:val="22"/>
                 <w:szCs w:val="22"/>
               </w:rPr>
-              <w:t xml:space="preserve">Yes, analysts Clea S. Garza and Maraya Chukwumerije and Simin Mohammad were comprehensively interviewed.</w:t>
+              <w:t xml:space="preserve">Yes, analysts Clea S. Garza and Maraya Chukwumerije and Sophia Santamaria were comprehensively interviewed.</w:t>
             </w:r>
           </w:p>
         </w:tc>
@@ -10754,7 +10754,7 @@
                 <w:rFonts w:ascii="Arial" w:hAnsi="Arial"/>
                 <w:sz w:val="16"/>
               </w:rPr>
-              <w:t xml:space="preserve">SMO</w:t>
+              <w:t xml:space="preserve">SAS</w:t>
             </w:r>
           </w:p>
         </w:tc>

</xml_diff>

<commit_message>
feat(em): add standalone EM Tables Word docx generator for Table 1 and Table 2
</commit_message>
<xml_diff>
--- a/OOS-261187_ScanCO_CGS_E001309_S1_UPDATED.docx
+++ b/OOS-261187_ScanCO_CGS_E001309_S1_UPDATED.docx
@@ -4939,7 +4939,7 @@
             <w:r>
               <w:t xml:space="preserve">Contact Plate:</w:t>
               <w:br/>
-              <w:t xml:space="preserve">1011543730</w:t>
+              <w:t xml:space="preserve">1011834770</w:t>
             </w:r>
           </w:p>
         </w:tc>
@@ -4951,7 +4951,7 @@
             <w:r>
               <w:t xml:space="preserve">Contact Plate:</w:t>
               <w:br/>
-              <w:t xml:space="preserve">29SEP2026</w:t>
+              <w:t xml:space="preserve">25 Sep 2026</w:t>
             </w:r>
           </w:p>
         </w:tc>

</xml_diff>